<commit_message>
firstboot-failure: 時間設定變因排除(NTP 可達/不可達/Host 模式 × 重開機)+ Stage 2 err_ntp_sync_failed 說明
- RCA docx 新增 4.3:四種時間設定只要中間重開機就失敗,不重開就成功;NTP/Host 模式不是變因
- README 補時間矩陣與「改 Host 模式就過」的正確解讀(過關前提=重跑且中間沒重開)

Co-Authored-By: Claude Fable 5.1 <noreply@anthropic.com>
</commit_message>
<xml_diff>
--- a/vc-8.0.3-to-9.1.1-firstboot-failure/doc/vCenter-8.0.3-to-9.1.1-Upgrade-Failure-RCA.docx
+++ b/vc-8.0.3-to-9.1.1-firstboot-failure/doc/vCenter-8.0.3-to-9.1.1-Upgrade-Failure-RCA.docx
@@ -2394,6 +2394,360 @@
           <w:szCs w:val="20"/>
         </w:rPr>
         <w:t xml:space="preserve">Lab 過程中也遇到 precheck 的 NTP / CEIP(KB 311872)/ VCF SDDC Manager 警告,與客戶一致,皆可修正或略過,並非 firstboot 失敗原因。</w:t>
+      </w:r>
+    </w:p>
+    <w:p>
+      <w:pPr>
+        <w:pStyle w:val="Heading2"/>
+        <w:spacing w:after="120" w:before="260"/>
+      </w:pPr>
+      <w:r>
+        <w:t xml:space="preserve">4.3 NTP / 時間同步變因排除(2026-09-22 補測)</w:t>
+      </w:r>
+    </w:p>
+    <w:p>
+      <w:pPr>
+        <w:spacing w:after="110"/>
+      </w:pPr>
+      <w:r>
+        <w:rPr>
+          <w:sz w:val="21"/>
+          <w:szCs w:val="21"/>
+        </w:rPr>
+        <w:t xml:space="preserve">客戶端曾有「把來源時間同步改成 Host 模式後升級就過了」的經驗,因此在 Lab 把時間設定當成獨立變因再測一輪。四種時間設定 × 有無重開機的結果如下:</w:t>
+      </w:r>
+    </w:p>
+    <w:tbl>
+      <w:tblPr>
+        <w:tblW w:type="dxa" w:w="9000"/>
+        <w:tblBorders>
+          <w:top w:val="single" w:color="auto" w:sz="4"/>
+          <w:left w:val="single" w:color="auto" w:sz="4"/>
+          <w:bottom w:val="single" w:color="auto" w:sz="4"/>
+          <w:right w:val="single" w:color="auto" w:sz="4"/>
+          <w:insideH w:val="single" w:color="auto" w:sz="4"/>
+          <w:insideV w:val="single" w:color="auto" w:sz="4"/>
+        </w:tblBorders>
+      </w:tblPr>
+      <w:tblGrid>
+        <w:gridCol w:w="3780"/>
+        <w:gridCol w:w="1800"/>
+        <w:gridCol w:w="3420"/>
+      </w:tblGrid>
+      <w:tr>
+        <w:trPr>
+          <w:tblHeader/>
+        </w:trPr>
+        <w:tc>
+          <w:tcPr>
+            <w:tcW w:type="dxa" w:w="3780"/>
+            <w:shd w:fill="1F4E79" w:val="clear"/>
+          </w:tcPr>
+          <w:p>
+            <w:r>
+              <w:rPr>
+                <w:b/>
+                <w:bCs/>
+                <w:color w:val="FFFFFF"/>
+                <w:sz w:val="19"/>
+                <w:szCs w:val="19"/>
+              </w:rPr>
+              <w:t xml:space="preserve">來源時間設定</w:t>
+            </w:r>
+          </w:p>
+        </w:tc>
+        <w:tc>
+          <w:tcPr>
+            <w:tcW w:type="dxa" w:w="1800"/>
+            <w:shd w:fill="1F4E79" w:val="clear"/>
+          </w:tcPr>
+          <w:p>
+            <w:r>
+              <w:rPr>
+                <w:b/>
+                <w:bCs/>
+                <w:color w:val="FFFFFF"/>
+                <w:sz w:val="19"/>
+                <w:szCs w:val="19"/>
+              </w:rPr>
+              <w:t xml:space="preserve">Stage 1 完成後</w:t>
+            </w:r>
+          </w:p>
+        </w:tc>
+        <w:tc>
+          <w:tcPr>
+            <w:tcW w:type="dxa" w:w="3420"/>
+            <w:shd w:fill="1F4E79" w:val="clear"/>
+          </w:tcPr>
+          <w:p>
+            <w:r>
+              <w:rPr>
+                <w:b/>
+                <w:bCs/>
+                <w:color w:val="FFFFFF"/>
+                <w:sz w:val="19"/>
+                <w:szCs w:val="19"/>
+              </w:rPr>
+              <w:t xml:space="preserve">結果</w:t>
+            </w:r>
+          </w:p>
+        </w:tc>
+      </w:tr>
+      <w:tr>
+        <w:tc>
+          <w:tcPr>
+            <w:tcW w:type="dxa" w:w="3780"/>
+          </w:tcPr>
+          <w:p>
+            <w:r>
+              <w:rPr>
+                <w:sz w:val="18"/>
+                <w:szCs w:val="18"/>
+              </w:rPr>
+              <w:t xml:space="preserve">NTP 169.254.169.123(客戶原設定,Lab 不可達)</w:t>
+            </w:r>
+          </w:p>
+        </w:tc>
+        <w:tc>
+          <w:tcPr>
+            <w:tcW w:type="dxa" w:w="1800"/>
+          </w:tcPr>
+          <w:p>
+            <w:r>
+              <w:rPr>
+                <w:sz w:val="18"/>
+                <w:szCs w:val="18"/>
+              </w:rPr>
+              <w:t xml:space="preserve">—</w:t>
+            </w:r>
+          </w:p>
+        </w:tc>
+        <w:tc>
+          <w:tcPr>
+            <w:tcW w:type="dxa" w:w="3420"/>
+          </w:tcPr>
+          <w:p>
+            <w:r>
+              <w:rPr>
+                <w:sz w:val="18"/>
+                <w:szCs w:val="18"/>
+              </w:rPr>
+              <w:t xml:space="preserve">Stage 2 precheck 擋在 NTP,到不了 firstboot</w:t>
+            </w:r>
+          </w:p>
+        </w:tc>
+      </w:tr>
+      <w:tr>
+        <w:tc>
+          <w:tcPr>
+            <w:tcW w:type="dxa" w:w="3780"/>
+            <w:shd w:fill="F7F9FC" w:val="clear"/>
+          </w:tcPr>
+          <w:p>
+            <w:r>
+              <w:rPr>
+                <w:sz w:val="18"/>
+                <w:szCs w:val="18"/>
+              </w:rPr>
+              <w:t xml:space="preserve">NTP 10.0.1.254(可達)</w:t>
+            </w:r>
+          </w:p>
+        </w:tc>
+        <w:tc>
+          <w:tcPr>
+            <w:tcW w:type="dxa" w:w="1800"/>
+            <w:shd w:fill="F7F9FC" w:val="clear"/>
+          </w:tcPr>
+          <w:p>
+            <w:r>
+              <w:rPr>
+                <w:sz w:val="18"/>
+                <w:szCs w:val="18"/>
+              </w:rPr>
+              <w:t xml:space="preserve">關機 / 開機</w:t>
+            </w:r>
+          </w:p>
+        </w:tc>
+        <w:tc>
+          <w:tcPr>
+            <w:tcW w:type="dxa" w:w="3420"/>
+            <w:shd w:fill="F7F9FC" w:val="clear"/>
+          </w:tcPr>
+          <w:p>
+            <w:r>
+              <w:rPr>
+                <w:sz w:val="18"/>
+                <w:szCs w:val="18"/>
+              </w:rPr>
+              <w:t xml:space="preserve">vmafd-firstboot [Errno 111] Connection refused(兩次)</w:t>
+            </w:r>
+          </w:p>
+        </w:tc>
+      </w:tr>
+      <w:tr>
+        <w:tc>
+          <w:tcPr>
+            <w:tcW w:type="dxa" w:w="3780"/>
+          </w:tcPr>
+          <w:p>
+            <w:r>
+              <w:rPr>
+                <w:sz w:val="18"/>
+                <w:szCs w:val="18"/>
+              </w:rPr>
+              <w:t xml:space="preserve">NTP 169.254.169.123(Lab 加別名讓它可達、已同步 offset 0.03ms)</w:t>
+            </w:r>
+          </w:p>
+        </w:tc>
+        <w:tc>
+          <w:tcPr>
+            <w:tcW w:type="dxa" w:w="1800"/>
+          </w:tcPr>
+          <w:p>
+            <w:r>
+              <w:rPr>
+                <w:sz w:val="18"/>
+                <w:szCs w:val="18"/>
+              </w:rPr>
+              <w:t xml:space="preserve">關機 / 開機</w:t>
+            </w:r>
+          </w:p>
+        </w:tc>
+        <w:tc>
+          <w:tcPr>
+            <w:tcW w:type="dxa" w:w="3420"/>
+          </w:tcPr>
+          <w:p>
+            <w:r>
+              <w:rPr>
+                <w:sz w:val="18"/>
+                <w:szCs w:val="18"/>
+              </w:rPr>
+              <w:t xml:space="preserve">vmafd-firstboot [Errno 111] Connection refused</w:t>
+            </w:r>
+          </w:p>
+        </w:tc>
+      </w:tr>
+      <w:tr>
+        <w:tc>
+          <w:tcPr>
+            <w:tcW w:type="dxa" w:w="3780"/>
+            <w:shd w:fill="F7F9FC" w:val="clear"/>
+          </w:tcPr>
+          <w:p>
+            <w:r>
+              <w:rPr>
+                <w:sz w:val="18"/>
+                <w:szCs w:val="18"/>
+              </w:rPr>
+              <w:t xml:space="preserve">Host 模式(與 ESXi 同步,ntpd 停用)</w:t>
+            </w:r>
+          </w:p>
+        </w:tc>
+        <w:tc>
+          <w:tcPr>
+            <w:tcW w:type="dxa" w:w="1800"/>
+            <w:shd w:fill="F7F9FC" w:val="clear"/>
+          </w:tcPr>
+          <w:p>
+            <w:r>
+              <w:rPr>
+                <w:sz w:val="18"/>
+                <w:szCs w:val="18"/>
+              </w:rPr>
+              <w:t xml:space="preserve">關機 / 開機</w:t>
+            </w:r>
+          </w:p>
+        </w:tc>
+        <w:tc>
+          <w:tcPr>
+            <w:tcW w:type="dxa" w:w="3420"/>
+            <w:shd w:fill="F7F9FC" w:val="clear"/>
+          </w:tcPr>
+          <w:p>
+            <w:r>
+              <w:rPr>
+                <w:sz w:val="18"/>
+                <w:szCs w:val="18"/>
+              </w:rPr>
+              <w:t xml:space="preserve">vmafd-firstboot [Errno 111] Connection refused</w:t>
+            </w:r>
+          </w:p>
+        </w:tc>
+      </w:tr>
+      <w:tr>
+        <w:tc>
+          <w:tcPr>
+            <w:tcW w:type="dxa" w:w="3780"/>
+          </w:tcPr>
+          <w:p>
+            <w:r>
+              <w:rPr>
+                <w:sz w:val="18"/>
+                <w:szCs w:val="18"/>
+              </w:rPr>
+              <w:t xml:space="preserve">NTP 10.0.1.254(可達)</w:t>
+            </w:r>
+          </w:p>
+        </w:tc>
+        <w:tc>
+          <w:tcPr>
+            <w:tcW w:type="dxa" w:w="1800"/>
+          </w:tcPr>
+          <w:p>
+            <w:r>
+              <w:rPr>
+                <w:sz w:val="18"/>
+                <w:szCs w:val="18"/>
+              </w:rPr>
+              <w:t xml:space="preserve">直接 CONTINUE</w:t>
+            </w:r>
+          </w:p>
+        </w:tc>
+        <w:tc>
+          <w:tcPr>
+            <w:tcW w:type="dxa" w:w="3420"/>
+          </w:tcPr>
+          <w:p>
+            <w:r>
+              <w:rPr>
+                <w:sz w:val="18"/>
+                <w:szCs w:val="18"/>
+              </w:rPr>
+              <w:t xml:space="preserve">升級完成(方式 A)</w:t>
+            </w:r>
+          </w:p>
+        </w:tc>
+      </w:tr>
+    </w:tbl>
+    <w:p>
+      <w:pPr>
+        <w:spacing w:after="110"/>
+      </w:pPr>
+      <w:r>
+        <w:rPr>
+          <w:sz w:val="21"/>
+          <w:szCs w:val="21"/>
+        </w:rPr>
+        <w:t xml:space="preserve">四種時間設定下只要中間重開機就失敗、不重開就成功,vmdird / vmafdd 的 PID 都是開機時 systemd 啟動的那兩個;時間同步模式與 NTP 位址不是變因。</w:t>
+      </w:r>
+    </w:p>
+    <w:p>
+      <w:pPr>
+        <w:pBdr>
+          <w:left w:val="single" w:color="B77E00" w:sz="18"/>
+        </w:pBdr>
+        <w:shd w:fill="FFF6E5" w:val="clear"/>
+        <w:spacing w:after="90" w:before="90"/>
+        <w:ind w:left="120" w:right="120"/>
+      </w:pPr>
+      <w:r>
+        <w:rPr>
+          <w:color w:val="B77E00"/>
+          <w:sz w:val="20"/>
+          <w:szCs w:val="20"/>
+        </w:rPr>
+        <w:t xml:space="preserve">補充:若新機(暫時 IP)連不到來源設定的 NTP server,Stage 2 會在 export 之後、firstboot 之前的「設定時間同步」失敗(com.vmware.applmgmt.err_ntp_sync_failed「Could not set up time synchronization」)。這是另一種失敗,把來源時間同步改成 Host 模式(或改用新機也連得到的 NTP)再重跑 Stage 1 → Stage 2 即可;客戶端「改 Host 就過」應是這種情況,而它能過關的前提同樣是重跑時中間沒有重開機。</w:t>
       </w:r>
     </w:p>
     <w:p>

</xml_diff>